<commit_message>
Implemented Bryce's presentation advice
</commit_message>
<xml_diff>
--- a/Weekly Logs/Dave/Week 9.docx
+++ b/Weekly Logs/Dave/Week 9.docx
@@ -1242,37 +1242,9 @@
           <w:tcPr>
             <w:tcW w:w="5063" w:type="dxa"/>
           </w:tcPr>
-          <w:p/>
-        </w:tc>
-      </w:tr>
-      <w:tr>
-        <w:tc>
-          <w:tcPr>
-            <w:tcW w:w="5427" w:type="dxa"/>
-          </w:tcPr>
           <w:p>
-            <w:pPr>
-              <w:rPr>
-                <w:b/>
-                <w:bCs/>
-              </w:rPr>
-            </w:pPr>
-            <w:r>
-              <w:rPr>
-                <w:b/>
-                <w:bCs/>
-              </w:rPr>
-              <w:t>Advisor meetings</w:t>
-            </w:r>
-          </w:p>
-        </w:tc>
-        <w:tc>
-          <w:tcPr>
-            <w:tcW w:w="5063" w:type="dxa"/>
-          </w:tcPr>
-          <w:p>
-            <w:r>
-              <w:t>3</w:t>
+            <w:r>
+              <w:t>2</w:t>
             </w:r>
           </w:p>
         </w:tc>
@@ -1294,7 +1266,7 @@
                 <w:b/>
                 <w:bCs/>
               </w:rPr>
-              <w:t>Research</w:t>
+              <w:t>Advisor meetings</w:t>
             </w:r>
           </w:p>
         </w:tc>
@@ -1304,7 +1276,7 @@
           </w:tcPr>
           <w:p>
             <w:r>
-              <w:t>3h 35m</w:t>
+              <w:t>3</w:t>
             </w:r>
           </w:p>
         </w:tc>
@@ -1326,7 +1298,7 @@
                 <w:b/>
                 <w:bCs/>
               </w:rPr>
-              <w:t>Development</w:t>
+              <w:t>Research</w:t>
             </w:r>
           </w:p>
         </w:tc>
@@ -1336,7 +1308,7 @@
           </w:tcPr>
           <w:p>
             <w:r>
-              <w:t>1</w:t>
+              <w:t>3h 35m</w:t>
             </w:r>
           </w:p>
         </w:tc>
@@ -1358,7 +1330,7 @@
                 <w:b/>
                 <w:bCs/>
               </w:rPr>
-              <w:t>Testing</w:t>
+              <w:t>Development</w:t>
             </w:r>
           </w:p>
         </w:tc>
@@ -1368,7 +1340,7 @@
           </w:tcPr>
           <w:p>
             <w:r>
-              <w:t>2</w:t>
+              <w:t>6h 15m</w:t>
             </w:r>
           </w:p>
         </w:tc>
@@ -1390,7 +1362,7 @@
                 <w:b/>
                 <w:bCs/>
               </w:rPr>
-              <w:t>Documentation</w:t>
+              <w:t>Testing</w:t>
             </w:r>
           </w:p>
         </w:tc>
@@ -1400,7 +1372,7 @@
           </w:tcPr>
           <w:p>
             <w:r>
-              <w:t>7</w:t>
+              <w:t>3</w:t>
             </w:r>
           </w:p>
         </w:tc>
@@ -1422,7 +1394,77 @@
                 <w:b/>
                 <w:bCs/>
               </w:rPr>
+              <w:t>Documentation</w:t>
+            </w:r>
+          </w:p>
+        </w:tc>
+        <w:tc>
+          <w:tcPr>
+            <w:tcW w:w="5063" w:type="dxa"/>
+          </w:tcPr>
+          <w:p>
+            <w:r>
+              <w:t>7</w:t>
+            </w:r>
+            <w:r>
+              <w:t>h 30</w:t>
+            </w:r>
+            <w:r>
+              <w:t>m</w:t>
+            </w:r>
+          </w:p>
+        </w:tc>
+      </w:tr>
+      <w:tr>
+        <w:tc>
+          <w:tcPr>
+            <w:tcW w:w="5427" w:type="dxa"/>
+          </w:tcPr>
+          <w:p>
+            <w:pPr>
+              <w:rPr>
+                <w:b/>
+                <w:bCs/>
+              </w:rPr>
+            </w:pPr>
+            <w:r>
+              <w:rPr>
+                <w:b/>
+                <w:bCs/>
+              </w:rPr>
               <w:t>Logbook preparation</w:t>
+            </w:r>
+          </w:p>
+        </w:tc>
+        <w:tc>
+          <w:tcPr>
+            <w:tcW w:w="5063" w:type="dxa"/>
+          </w:tcPr>
+          <w:p>
+            <w:r>
+              <w:t>1</w:t>
+            </w:r>
+          </w:p>
+        </w:tc>
+      </w:tr>
+      <w:tr>
+        <w:tc>
+          <w:tcPr>
+            <w:tcW w:w="5427" w:type="dxa"/>
+          </w:tcPr>
+          <w:p>
+            <w:pPr>
+              <w:rPr>
+                <w:b/>
+                <w:bCs/>
+              </w:rPr>
+            </w:pPr>
+            <w:r>
+              <w:rPr>
+                <w:b/>
+                <w:bCs/>
+              </w:rPr>
+              <w:t>Other</w:t>
             </w:r>
           </w:p>
         </w:tc>
@@ -1450,7 +1492,7 @@
                 <w:b/>
                 <w:bCs/>
               </w:rPr>
-              <w:t>Other</w:t>
+              <w:t>Total hours for this week</w:t>
             </w:r>
           </w:p>
         </w:tc>
@@ -1458,7 +1500,11 @@
           <w:tcPr>
             <w:tcW w:w="5063" w:type="dxa"/>
           </w:tcPr>
-          <w:p/>
+          <w:p>
+            <w:r>
+              <w:t>34h 20m</w:t>
+            </w:r>
+          </w:p>
         </w:tc>
       </w:tr>
       <w:tr>
@@ -1478,7 +1524,14 @@
                 <w:b/>
                 <w:bCs/>
               </w:rPr>
-              <w:t>Total hours for this week</w:t>
+              <w:t>Running total</w:t>
+            </w:r>
+            <w:r>
+              <w:rPr>
+                <w:b/>
+                <w:bCs/>
+              </w:rPr>
+              <w:t xml:space="preserve"> of hours completed for Capstone</w:t>
             </w:r>
           </w:p>
         </w:tc>
@@ -1486,42 +1539,14 @@
           <w:tcPr>
             <w:tcW w:w="5063" w:type="dxa"/>
           </w:tcPr>
-          <w:p/>
-        </w:tc>
-      </w:tr>
-      <w:tr>
-        <w:tc>
-          <w:tcPr>
-            <w:tcW w:w="5427" w:type="dxa"/>
-          </w:tcPr>
           <w:p>
-            <w:pPr>
-              <w:rPr>
-                <w:b/>
-                <w:bCs/>
-              </w:rPr>
-            </w:pPr>
-            <w:r>
-              <w:rPr>
-                <w:b/>
-                <w:bCs/>
-              </w:rPr>
-              <w:t>Running total</w:t>
-            </w:r>
-            <w:r>
-              <w:rPr>
-                <w:b/>
-                <w:bCs/>
-              </w:rPr>
-              <w:t xml:space="preserve"> of hours completed for Capstone</w:t>
+            <w:r>
+              <w:t>19</w:t>
+            </w:r>
+            <w:r>
+              <w:t>4</w:t>
             </w:r>
           </w:p>
-        </w:tc>
-        <w:tc>
-          <w:tcPr>
-            <w:tcW w:w="5063" w:type="dxa"/>
-          </w:tcPr>
-          <w:p/>
         </w:tc>
       </w:tr>
     </w:tbl>
@@ -1650,13 +1675,18 @@
         </w:rPr>
         <w:t>:</w:t>
       </w:r>
+    </w:p>
+    <w:p>
+      <w:pPr>
+        <w:rPr>
+          <w:lang w:val="en-NZ"/>
+        </w:rPr>
+      </w:pPr>
       <w:r>
         <w:rPr>
-          <w:b/>
-          <w:bCs/>
           <w:lang w:val="en-NZ"/>
         </w:rPr>
-        <w:t xml:space="preserve"> </w:t>
+        <w:t>Friday 10-12pm</w:t>
       </w:r>
     </w:p>
     <w:p>
@@ -2369,6 +2399,7 @@
   <w:style w:type="character" w:default="1" w:styleId="DefaultParagraphFont">
     <w:name w:val="Default Paragraph Font"/>
     <w:uiPriority w:val="1"/>
+    <w:semiHidden/>
     <w:unhideWhenUsed/>
   </w:style>
   <w:style w:type="table" w:default="1" w:styleId="TableNormal">

</xml_diff>